<commit_message>
Multiple updates to report assembly functions
</commit_message>
<xml_diff>
--- a/inst/captions/variable_trend_maps_caption.docx
+++ b/inst/captions/variable_trend_maps_caption.docx
@@ -5,121 +5,122 @@
     <w:p>
       <w:pPr>
         <w:pStyle w:val="PlainText"/>
-        <w:rPr>
-          <w:rFonts w:ascii="Calibri" w:hAnsi="Calibri" w:cs="Calibri"/>
-          <w:sz w:val="24"/>
-          <w:szCs w:val="24"/>
+        <w:ind w:left="720" w:right="957"/>
+        <w:rPr>
+          <w:rFonts w:ascii="Calibri" w:hAnsi="Calibri" w:cs="Calibri"/>
+          <w:sz w:val="20"/>
+          <w:szCs w:val="20"/>
         </w:rPr>
       </w:pPr>
       <w:r>
         <w:rPr>
           <w:rFonts w:ascii="Calibri" w:hAnsi="Calibri" w:cs="Calibri"/>
-          <w:sz w:val="24"/>
-          <w:szCs w:val="24"/>
+          <w:sz w:val="20"/>
+          <w:szCs w:val="20"/>
         </w:rPr>
         <w:t xml:space="preserve">PREDICTOR </w:t>
       </w:r>
       <w:r>
         <w:rPr>
           <w:rFonts w:ascii="Calibri" w:hAnsi="Calibri" w:cs="Calibri"/>
-          <w:sz w:val="24"/>
-          <w:szCs w:val="24"/>
+          <w:sz w:val="20"/>
+          <w:szCs w:val="20"/>
         </w:rPr>
         <w:t>VARIABLE TRENDS.</w:t>
       </w:r>
       <w:r>
         <w:rPr>
           <w:rFonts w:ascii="Calibri" w:hAnsi="Calibri" w:cs="Calibri"/>
-          <w:sz w:val="24"/>
-          <w:szCs w:val="24"/>
+          <w:sz w:val="20"/>
+          <w:szCs w:val="20"/>
         </w:rPr>
         <w:t xml:space="preserve"> Figure</w:t>
       </w:r>
       <w:r>
         <w:rPr>
           <w:rFonts w:ascii="Calibri" w:hAnsi="Calibri" w:cs="Calibri"/>
-          <w:sz w:val="24"/>
-          <w:szCs w:val="24"/>
+          <w:sz w:val="20"/>
+          <w:szCs w:val="20"/>
         </w:rPr>
         <w:t>s</w:t>
       </w:r>
       <w:r>
         <w:rPr>
           <w:rFonts w:ascii="Calibri" w:hAnsi="Calibri" w:cs="Calibri"/>
-          <w:sz w:val="24"/>
-          <w:szCs w:val="24"/>
+          <w:sz w:val="20"/>
+          <w:szCs w:val="20"/>
         </w:rPr>
         <w:t xml:space="preserve"> on the following </w:t>
       </w:r>
       <w:r>
         <w:rPr>
           <w:rFonts w:ascii="Calibri" w:hAnsi="Calibri" w:cs="Calibri"/>
-          <w:sz w:val="24"/>
-          <w:szCs w:val="24"/>
+          <w:sz w:val="20"/>
+          <w:szCs w:val="20"/>
         </w:rPr>
         <w:t xml:space="preserve">two </w:t>
       </w:r>
       <w:r>
         <w:rPr>
           <w:rFonts w:ascii="Calibri" w:hAnsi="Calibri" w:cs="Calibri"/>
-          <w:sz w:val="24"/>
-          <w:szCs w:val="24"/>
+          <w:sz w:val="20"/>
+          <w:szCs w:val="20"/>
         </w:rPr>
         <w:t>pages</w:t>
       </w:r>
       <w:r>
         <w:rPr>
           <w:rFonts w:ascii="Calibri" w:hAnsi="Calibri" w:cs="Calibri"/>
-          <w:sz w:val="24"/>
-          <w:szCs w:val="24"/>
+          <w:sz w:val="20"/>
+          <w:szCs w:val="20"/>
         </w:rPr>
         <w:t xml:space="preserve"> </w:t>
       </w:r>
       <w:r>
         <w:rPr>
           <w:rFonts w:ascii="Calibri" w:hAnsi="Calibri" w:cs="Calibri"/>
-          <w:sz w:val="24"/>
-          <w:szCs w:val="24"/>
+          <w:sz w:val="20"/>
+          <w:szCs w:val="20"/>
         </w:rPr>
         <w:t xml:space="preserve">show </w:t>
       </w:r>
       <w:r>
         <w:rPr>
           <w:rFonts w:ascii="Calibri" w:hAnsi="Calibri" w:cs="Calibri"/>
-          <w:sz w:val="24"/>
-          <w:szCs w:val="24"/>
+          <w:sz w:val="20"/>
+          <w:szCs w:val="20"/>
         </w:rPr>
         <w:t xml:space="preserve">trends in the Top 10 contributing MERRA-2 (M2) and MERRAclim-2 (MC) variables identified in the analysis. Variables are arranged in descending order of contribution to the overall time series. Maps on the left of each row show the </w:t>
       </w:r>
       <w:r>
         <w:rPr>
           <w:rFonts w:ascii="Calibri" w:hAnsi="Calibri" w:cs="Calibri"/>
-          <w:sz w:val="24"/>
-          <w:szCs w:val="24"/>
+          <w:sz w:val="20"/>
+          <w:szCs w:val="20"/>
         </w:rPr>
         <w:t xml:space="preserve">historical </w:t>
       </w:r>
       <w:r>
         <w:rPr>
           <w:rFonts w:ascii="Calibri" w:hAnsi="Calibri" w:cs="Calibri"/>
-          <w:sz w:val="24"/>
-          <w:szCs w:val="24"/>
+          <w:sz w:val="20"/>
+          <w:szCs w:val="20"/>
         </w:rPr>
         <w:t>trend in the modeled variable</w:t>
       </w:r>
       <w:r>
         <w:rPr>
           <w:rFonts w:ascii="Calibri" w:hAnsi="Calibri" w:cs="Calibri"/>
-          <w:sz w:val="24"/>
-          <w:szCs w:val="24"/>
+          <w:sz w:val="20"/>
+          <w:szCs w:val="20"/>
         </w:rPr>
         <w:t xml:space="preserve">; </w:t>
       </w:r>
       <w:r>
         <w:rPr>
           <w:rFonts w:ascii="Calibri" w:hAnsi="Calibri" w:cs="Calibri"/>
-          <w:sz w:val="24"/>
-          <w:szCs w:val="24"/>
+          <w:sz w:val="20"/>
+          <w:szCs w:val="20"/>
         </w:rPr>
         <w:t xml:space="preserve">maps on the right show the rate of change (acceleration / deceleration) in the variable. </w:t>
       </w:r>
@@ -127,107 +128,109 @@
     <w:p>
       <w:pPr>
         <w:pStyle w:val="PlainText"/>
-        <w:rPr>
-          <w:rFonts w:ascii="Calibri" w:hAnsi="Calibri" w:cs="Calibri"/>
-          <w:sz w:val="24"/>
-          <w:szCs w:val="24"/>
+        <w:ind w:left="720" w:right="957"/>
+        <w:rPr>
+          <w:rFonts w:ascii="Calibri" w:hAnsi="Calibri" w:cs="Calibri"/>
+          <w:sz w:val="20"/>
+          <w:szCs w:val="20"/>
         </w:rPr>
       </w:pPr>
     </w:p>
     <w:p>
       <w:pPr>
         <w:pStyle w:val="PlainText"/>
-        <w:rPr>
-          <w:rFonts w:ascii="Calibri" w:hAnsi="Calibri" w:cs="Calibri"/>
-          <w:sz w:val="24"/>
-          <w:szCs w:val="24"/>
+        <w:ind w:left="720" w:right="957"/>
+        <w:rPr>
+          <w:rFonts w:ascii="Calibri" w:hAnsi="Calibri" w:cs="Calibri"/>
+          <w:sz w:val="20"/>
+          <w:szCs w:val="20"/>
         </w:rPr>
       </w:pPr>
       <w:r>
         <w:rPr>
           <w:rFonts w:ascii="Calibri" w:hAnsi="Calibri" w:cs="Calibri"/>
-          <w:sz w:val="24"/>
-          <w:szCs w:val="24"/>
+          <w:sz w:val="20"/>
+          <w:szCs w:val="20"/>
         </w:rPr>
         <w:t>A thin blue line to the left of a variable indicates that the</w:t>
       </w:r>
       <w:r>
         <w:rPr>
           <w:rFonts w:ascii="Calibri" w:hAnsi="Calibri" w:cs="Calibri"/>
-          <w:sz w:val="24"/>
-          <w:szCs w:val="24"/>
+          <w:sz w:val="20"/>
+          <w:szCs w:val="20"/>
         </w:rPr>
         <w:t xml:space="preserve">re was a strong positive or negative directional trend in the relative contribution of </w:t>
       </w:r>
       <w:r>
         <w:rPr>
           <w:rFonts w:ascii="Calibri" w:hAnsi="Calibri" w:cs="Calibri"/>
-          <w:sz w:val="24"/>
-          <w:szCs w:val="24"/>
+          <w:sz w:val="20"/>
+          <w:szCs w:val="20"/>
         </w:rPr>
         <w:t>the</w:t>
       </w:r>
       <w:r>
         <w:rPr>
           <w:rFonts w:ascii="Calibri" w:hAnsi="Calibri" w:cs="Calibri"/>
-          <w:sz w:val="24"/>
-          <w:szCs w:val="24"/>
+          <w:sz w:val="20"/>
+          <w:szCs w:val="20"/>
         </w:rPr>
         <w:t xml:space="preserve"> variable over the span of the time series</w:t>
       </w:r>
       <w:r>
         <w:rPr>
           <w:rFonts w:ascii="Calibri" w:hAnsi="Calibri" w:cs="Calibri"/>
-          <w:sz w:val="24"/>
-          <w:szCs w:val="24"/>
+          <w:sz w:val="20"/>
+          <w:szCs w:val="20"/>
         </w:rPr>
         <w:br/>
       </w:r>
       <w:r>
         <w:rPr>
           <w:rFonts w:ascii="Calibri" w:hAnsi="Calibri" w:cs="Calibri"/>
-          <w:sz w:val="24"/>
-          <w:szCs w:val="24"/>
+          <w:sz w:val="20"/>
+          <w:szCs w:val="20"/>
         </w:rPr>
         <w:t>[ Bayesian Probability of Direction (PD) &gt;= 90.0% ]</w:t>
       </w:r>
       <w:r>
         <w:rPr>
           <w:rFonts w:ascii="Calibri" w:hAnsi="Calibri" w:cs="Calibri"/>
-          <w:sz w:val="24"/>
-          <w:szCs w:val="24"/>
+          <w:sz w:val="20"/>
+          <w:szCs w:val="20"/>
         </w:rPr>
         <w:t>. See accompanying Variable Contributions plot and Variable Trend Summar</w:t>
       </w:r>
       <w:r>
         <w:rPr>
           <w:rFonts w:ascii="Calibri" w:hAnsi="Calibri" w:cs="Calibri"/>
-          <w:sz w:val="24"/>
-          <w:szCs w:val="24"/>
+          <w:sz w:val="20"/>
+          <w:szCs w:val="20"/>
         </w:rPr>
         <w:t>y</w:t>
       </w:r>
       <w:r>
         <w:rPr>
           <w:rFonts w:ascii="Calibri" w:hAnsi="Calibri" w:cs="Calibri"/>
-          <w:sz w:val="24"/>
-          <w:szCs w:val="24"/>
+          <w:sz w:val="20"/>
+          <w:szCs w:val="20"/>
         </w:rPr>
         <w:t xml:space="preserve"> table for more </w:t>
       </w:r>
       <w:r>
         <w:rPr>
           <w:rFonts w:ascii="Calibri" w:hAnsi="Calibri" w:cs="Calibri"/>
-          <w:sz w:val="24"/>
-          <w:szCs w:val="24"/>
+          <w:sz w:val="20"/>
+          <w:szCs w:val="20"/>
         </w:rPr>
         <w:t>information</w:t>
       </w:r>
       <w:r>
         <w:rPr>
           <w:rFonts w:ascii="Calibri" w:hAnsi="Calibri" w:cs="Calibri"/>
-          <w:sz w:val="24"/>
-          <w:szCs w:val="24"/>
+          <w:sz w:val="20"/>
+          <w:szCs w:val="20"/>
         </w:rPr>
         <w:t>.</w:t>
       </w:r>

</xml_diff>

<commit_message>
Improvements to report generation
</commit_message>
<xml_diff>
--- a/inst/captions/variable_trend_maps_caption.docx
+++ b/inst/captions/variable_trend_maps_caption.docx
@@ -1,31 +1,39 @@
 
 <file path=word/document.xml><?xml version="1.0" encoding="utf-8"?>
-<w:document xmlns:wpc="http://schemas.microsoft.com/office/word/2010/wordprocessingCanvas" xmlns:cx="http://schemas.microsoft.com/office/drawing/2014/chartex" xmlns:cx1="http://schemas.microsoft.com/office/drawing/2015/9/8/chartex" xmlns:cx2="http://schemas.microsoft.com/office/drawing/2015/10/21/chartex" xmlns:cx3="http://schemas.microsoft.com/office/drawing/2016/5/9/chartex" xmlns:cx4="http://schemas.microsoft.com/office/drawing/2016/5/10/chartex" xmlns:cx5="http://schemas.microsoft.com/office/drawing/2016/5/11/chartex" xmlns:cx6="http://schemas.microsoft.com/office/drawing/2016/5/12/chartex" xmlns:cx7="http://schemas.microsoft.com/office/drawing/2016/5/13/chartex" xmlns:cx8="http://schemas.microsoft.com/office/drawing/2016/5/14/chartex" xmlns:mc="http://schemas.openxmlformats.org/markup-compatibility/2006" xmlns:aink="http://schemas.microsoft.com/office/drawing/2016/ink" xmlns:am3d="http://schemas.microsoft.com/office/drawing/2017/model3d" xmlns:o="urn:schemas-microsoft-com:office:office" xmlns:oel="http://schemas.microsoft.com/office/2019/extlst" xmlns:r="http://schemas.openxmlformats.org/officeDocument/2006/relationships" xmlns:m="http://schemas.openxmlformats.org/officeDocument/2006/math" xmlns:v="urn:schemas-microsoft-com:vml" xmlns:wp14="http://schemas.microsoft.com/office/word/2010/wordprocessingDrawing" xmlns:wp="http://schemas.openxmlformats.org/drawingml/2006/wordprocessingDrawing" xmlns:w10="urn:schemas-microsoft-com:office:word" xmlns:w="http://schemas.openxmlformats.org/wordprocessingml/2006/main" xmlns:w14="http://schemas.microsoft.com/office/word/2010/wordml" xmlns:w15="http://schemas.microsoft.com/office/word/2012/wordml" xmlns:w16cex="http://schemas.microsoft.com/office/word/2018/wordml/cex" xmlns:w16cid="http://schemas.microsoft.com/office/word/2016/wordml/cid" xmlns:w16="http://schemas.microsoft.com/office/word/2018/wordml" xmlns:w16du="http://schemas.microsoft.com/office/word/2023/wordml/word16du" xmlns:w16sdtdh="http://schemas.microsoft.com/office/word/2020/wordml/sdtdatahash" xmlns:w16sdtfl="http://schemas.microsoft.com/office/word/2024/wordml/sdtformatlock" xmlns:w16se="http://schemas.microsoft.com/office/word/2015/wordml/symex" xmlns:wpg="http://schemas.microsoft.com/office/word/2010/wordprocessingGroup" xmlns:wpi="http://schemas.microsoft.com/office/word/2010/wordprocessingInk" xmlns:wne="http://schemas.microsoft.com/office/word/2006/wordml" xmlns:wps="http://schemas.microsoft.com/office/word/2010/wordprocessingShape" mc:Ignorable="w14 w15 w16se w16cid w16 w16cex w16sdtdh w16sdtfl w16du wp14">
+<w:document xmlns:wpc="http://schemas.microsoft.com/office/word/2010/wordprocessingCanvas" xmlns:cx="http://schemas.microsoft.com/office/drawing/2014/chartex" xmlns:cx1="http://schemas.microsoft.com/office/drawing/2015/9/8/chartex" xmlns:cx2="http://schemas.microsoft.com/office/drawing/2015/10/21/chartex" xmlns:cx3="http://schemas.microsoft.com/office/drawing/2016/5/9/chartex" xmlns:cx4="http://schemas.microsoft.com/office/drawing/2016/5/10/chartex" xmlns:cx5="http://schemas.microsoft.com/office/drawing/2016/5/11/chartex" xmlns:cx6="http://schemas.microsoft.com/office/drawing/2016/5/12/chartex" xmlns:cx7="http://schemas.microsoft.com/office/drawing/2016/5/13/chartex" xmlns:cx8="http://schemas.microsoft.com/office/drawing/2016/5/14/chartex" xmlns:mc="http://schemas.openxmlformats.org/markup-compatibility/2006" xmlns:m="http://schemas.openxmlformats.org/officeDocument/2006/math" xmlns:aink="http://schemas.microsoft.com/office/drawing/2016/ink" xmlns:am3d="http://schemas.microsoft.com/office/drawing/2017/model3d" xmlns:oel="http://schemas.microsoft.com/office/2019/extlst" xmlns:r="http://schemas.openxmlformats.org/officeDocument/2006/relationships" xmlns:wp14="http://schemas.microsoft.com/office/word/2010/wordprocessingDrawing" xmlns:wp="http://schemas.openxmlformats.org/drawingml/2006/wordprocessingDrawing" xmlns:wpg="http://schemas.microsoft.com/office/word/2010/wordprocessingGroup" xmlns:wpi="http://schemas.microsoft.com/office/word/2010/wordprocessingInk" xmlns:wps="http://schemas.microsoft.com/office/word/2010/wordprocessingShape" xmlns:o="urn:schemas-microsoft-com:office:office" xmlns:v="urn:schemas-microsoft-com:vml" xmlns:w10="urn:schemas-microsoft-com:office:word" xmlns:w="http://schemas.openxmlformats.org/wordprocessingml/2006/main" xmlns:w14="http://schemas.microsoft.com/office/word/2010/wordml" xmlns:w15="http://schemas.microsoft.com/office/word/2012/wordml" xmlns:w16cex="http://schemas.microsoft.com/office/word/2018/wordml/cex" xmlns:w16cid="http://schemas.microsoft.com/office/word/2016/wordml/cid" xmlns:w16="http://schemas.microsoft.com/office/word/2018/wordml" xmlns:w16sdtdh="http://schemas.microsoft.com/office/word/2020/wordml/sdtdatahash" xmlns:w16sdtfl="http://schemas.microsoft.com/office/word/2024/wordml/sdtformatlock" xmlns:w16se="http://schemas.microsoft.com/office/word/2015/wordml/symex" xmlns:w16du="http://schemas.microsoft.com/office/word/2023/wordml/word16du" xmlns:wne="http://schemas.microsoft.com/office/word/2006/wordml" mc:Ignorable="w14 w15 w16se w16cid w16 w16cex w16sdtdh w16sdtfl w16du wp14">
   <w:body>
     <w:p>
       <w:pPr>
         <w:pStyle w:val="font-claude-response-body"/>
         <w:rPr>
           <w:rFonts w:ascii="Calibri" w:hAnsi="Calibri" w:cs="Calibri"/>
+          <w:sz w:val="20"/>
+          <w:szCs w:val="20"/>
         </w:rPr>
       </w:pPr>
       <w:r>
         <w:rPr>
           <w:rFonts w:ascii="Calibri" w:hAnsi="Calibri" w:cs="Calibri"/>
+          <w:sz w:val="20"/>
+          <w:szCs w:val="20"/>
         </w:rPr>
-        <w:t xml:space="preserve">PREDICTOR VARIABLE TRENDS. The following pages show how the top </w:t>
+        <w:t>PREDICTOR VARIABLE TRENDS. The following pages show how the top contributing MERRA-2 and MERRAclim-2</w:t>
       </w:r>
       <w:r>
         <w:rPr>
           <w:rFonts w:ascii="Calibri" w:hAnsi="Calibri" w:cs="Calibri"/>
+          <w:sz w:val="20"/>
+          <w:szCs w:val="20"/>
         </w:rPr>
-        <w:t xml:space="preserve">10 </w:t>
+        <w:t xml:space="preserve"> </w:t>
       </w:r>
       <w:r>
         <w:rPr>
           <w:rFonts w:ascii="Calibri" w:hAnsi="Calibri" w:cs="Calibri"/>
+          <w:sz w:val="20"/>
+          <w:szCs w:val="20"/>
         </w:rPr>
-        <w:t>contributing MERRA-2 (M2) and MERRAclim-2 (MC) environmental predictor variables have changed across the landscape over the study period. Variables are those identified by the convergence-based screening procedure as the strongest contributors to the ensemble models; they are arranged in descending order of average contribution to the overall time series.</w:t>
+        <w:t>environmental predictor variables have changed across the landscape over the study period. Variables are those identified by the convergence-based screening procedure as the strongest contributors to the ensemble models; they are arranged in descending order of average contribution to the overall time series.</w:t>
       </w:r>
     </w:p>
     <w:p>
@@ -33,11 +41,15 @@
         <w:pStyle w:val="font-claude-response-body"/>
         <w:rPr>
           <w:rFonts w:ascii="Calibri" w:hAnsi="Calibri" w:cs="Calibri"/>
+          <w:sz w:val="20"/>
+          <w:szCs w:val="20"/>
         </w:rPr>
       </w:pPr>
       <w:r>
         <w:rPr>
           <w:rFonts w:ascii="Calibri" w:hAnsi="Calibri" w:cs="Calibri"/>
+          <w:sz w:val="20"/>
+          <w:szCs w:val="20"/>
         </w:rPr>
         <w:t>Each variable occupies one row. The left panel shows the per-cell Theil-Sen trend over the study period. The right panel shows the trend in the rate of change over the same period, identifying areas where the variable is increasing or decreasing at an accelerating or decelerating rate. In both panels, green indicates increasing values and red indicates decreasing values.</w:t>
       </w:r>
@@ -47,11 +59,15 @@
         <w:pStyle w:val="font-claude-response-body"/>
         <w:rPr>
           <w:rFonts w:ascii="Calibri" w:hAnsi="Calibri" w:cs="Calibri"/>
+          <w:sz w:val="20"/>
+          <w:szCs w:val="20"/>
         </w:rPr>
       </w:pPr>
       <w:r>
         <w:rPr>
           <w:rFonts w:ascii="Calibri" w:hAnsi="Calibri" w:cs="Calibri"/>
+          <w:sz w:val="20"/>
+          <w:szCs w:val="20"/>
         </w:rPr>
         <w:t>A blue sidebar marks variables whose relative contribution to the ensemble models showed a strong directional trend across the study period (Bayesian probability of direction PD ≥ 90%). See the Variable Contribution Trends figure and table for details.</w:t>
       </w:r>
@@ -78,7 +94,7 @@
 </file>
 
 <file path=word/styles.xml><?xml version="1.0" encoding="utf-8"?>
-<w:styles xmlns:mc="http://schemas.openxmlformats.org/markup-compatibility/2006" xmlns:r="http://schemas.openxmlformats.org/officeDocument/2006/relationships" xmlns:w="http://schemas.openxmlformats.org/wordprocessingml/2006/main" xmlns:w14="http://schemas.microsoft.com/office/word/2010/wordml" xmlns:w15="http://schemas.microsoft.com/office/word/2012/wordml" xmlns:w16cex="http://schemas.microsoft.com/office/word/2018/wordml/cex" xmlns:w16cid="http://schemas.microsoft.com/office/word/2016/wordml/cid" xmlns:w16="http://schemas.microsoft.com/office/word/2018/wordml" xmlns:w16du="http://schemas.microsoft.com/office/word/2023/wordml/word16du" xmlns:w16sdtdh="http://schemas.microsoft.com/office/word/2020/wordml/sdtdatahash" xmlns:w16sdtfl="http://schemas.microsoft.com/office/word/2024/wordml/sdtformatlock" xmlns:w16se="http://schemas.microsoft.com/office/word/2015/wordml/symex" mc:Ignorable="w14 w15 w16se w16cid w16 w16cex w16sdtdh w16sdtfl w16du">
+<w:styles xmlns:mc="http://schemas.openxmlformats.org/markup-compatibility/2006" xmlns:r="http://schemas.openxmlformats.org/officeDocument/2006/relationships" xmlns:w="http://schemas.openxmlformats.org/wordprocessingml/2006/main" xmlns:w14="http://schemas.microsoft.com/office/word/2010/wordml" xmlns:w15="http://schemas.microsoft.com/office/word/2012/wordml" xmlns:w16cex="http://schemas.microsoft.com/office/word/2018/wordml/cex" xmlns:w16cid="http://schemas.microsoft.com/office/word/2016/wordml/cid" xmlns:w16="http://schemas.microsoft.com/office/word/2018/wordml" xmlns:w16sdtdh="http://schemas.microsoft.com/office/word/2020/wordml/sdtdatahash" xmlns:w16sdtfl="http://schemas.microsoft.com/office/word/2024/wordml/sdtformatlock" xmlns:w16se="http://schemas.microsoft.com/office/word/2015/wordml/symex" xmlns:w16du="http://schemas.microsoft.com/office/word/2023/wordml/word16du" mc:Ignorable="w14 w15 w16se w16cid w16 w16cex w16sdtdh w16sdtfl w16du">
   <w:docDefaults>
     <w:rPrDefault>
       <w:rPr>

</xml_diff>